<commit_message>
test(plugins): a paragraph joined by a tracked deletion in the Word 97 fixture
format.fodt gains a deletion across a paragraph mark; LibreOffice
writes it as a deleted paragraph mark, which the reader joins. The
run comparison with the .docx copy reads across paragraphs, since the
OOXML reader keeps the two paragraphs apart.

Co-Authored-By: Claude Opus 5.5 <noreply@anthropic.com>
Signed-off-by: Team endue <team@endue.ai>
</commit_message>
<xml_diff>
--- a/plugins/docs/tests/fixtures/doc/format.docx
+++ b/plugins/docs/tests/fixtures/doc/format.docx
@@ -195,6 +195,46 @@
       <w:r>
         <w:rPr/>
         <w:t xml:space="preserve"> show.</w:t>
+      </w:r>
+    </w:p>
+    <w:p>
+      <w:pPr>
+        <w:pStyle w:val="Normal"/>
+        <w:bidi w:val="0"/>
+        <w:spacing w:before="0" w:after="144"/>
+        <w:jc w:val="start"/>
+        <w:rPr>
+          <w:del w:id="3" w:author="Mina Park" w:date="2026-10-21T09:10:00Z"/>
+        </w:rPr>
+      </w:pPr>
+      <w:r>
+        <w:rPr/>
+        <w:t xml:space="preserve">Joined: first half </w:t>
+      </w:r>
+      <w:del w:id="2" w:author="Mina Park" w:date="2026-10-21T09:10:00Z">
+        <w:r>
+          <w:rPr/>
+          <w:delText>was cut here.</w:delText>
+        </w:r>
+      </w:del>
+    </w:p>
+    <w:p>
+      <w:pPr>
+        <w:pStyle w:val="Normal"/>
+        <w:bidi w:val="0"/>
+        <w:spacing w:before="0" w:after="144"/>
+        <w:jc w:val="start"/>
+        <w:rPr/>
+      </w:pPr>
+      <w:del w:id="4" w:author="Mina Park" w:date="2026-10-21T09:10:00Z">
+        <w:r>
+          <w:rPr/>
+          <w:delText xml:space="preserve">Removed lead-in </w:delText>
+        </w:r>
+      </w:del>
+      <w:r>
+        <w:rPr/>
+        <w:t>and second half.</w:t>
       </w:r>
     </w:p>
     <w:p>

</xml_diff>